<commit_message>
Write table text into the paragraph that carries the formatting
Cells in the reference booklet open with an empty, unformatted paragraph
before the one holding the styled text. The filler wrote into
paragraphs[0], so everything it set landed with no run properties: the EQ
Dimension header rendered small and black instead of white Georgia bold,
and the table's body rows lost their size and weight. Pick the paragraph
that actually carries the formatting instead, and place the rebuild
marker there too.

Also copy the strengths caption's run properties wholesale onto the
development caption. Setting only the colour left it without the
letter-spacing its counterpart has, so the two headings did not match.

Co-Authored-By: Claude Opus 5 <noreply@anthropic.com>
</commit_message>
<xml_diff>
--- a/sdg_disc_dash/utils/roadmap_template.docx
+++ b/sdg_disc_dash/utils/roadmap_template.docx
@@ -11931,10 +11931,10 @@
         <w:rPr>
           <w:rFonts w:ascii="Calibri" w:hAnsi="Calibri"/>
           <w:b/>
-          <w:bCs/>
+          <w:color w:val="B59824"/>
+          <w:spacing w:val="28"/>
           <w:sz w:val="28"/>
           <w:szCs w:val="28"/>
-          <w:color w:val="B59824"/>
         </w:rPr>
         <w:t>LEADERSHIP CAPACITIES TO STRENGTHEN</w:t>
       </w:r>
@@ -12259,6 +12259,13 @@
               </w:rPr>
             </w:pPr>
             <w:r>
+              <w:rPr>
+                <w:rFonts w:ascii="Georgia" w:hAnsi="Georgia"/>
+                <w:b/>
+                <w:color w:val="FFFFFF" w:themeColor="background1"/>
+                <w:sz w:val="24"/>
+                <w:szCs w:val="24"/>
+              </w:rPr>
               <w:t>{{TABLE:EQ_DIMENSIONS}}</w:t>
             </w:r>
           </w:p>

</xml_diff>